<commit_message>
FRD v1.2: articulos sin stock en la sugerencia aunque no tengan umbral
- Regla C4: solo deja afuera a los articulos sin umbral que tienen stock.
  Un articulo sin stock entra siempre por la regla C1, como ya muestra
  la lista de reposicion del Dashboard.
- Reglas Q1 y Q2: el stock objetivo y la cantidad sugerida se calculan
  solo si el articulo tiene umbral minimo.
- Historial: una linea mas en la fila de la version 1.2.
- El titulo "2 Alcance" empieza en pagina nueva por si mismo, en lugar
  del parrafo con el salto de pagina, que con la linea nueva del
  historial quedaba solo en una hoja en blanco. El documento sigue con
  28 paginas.
</commit_message>
<xml_diff>
--- a/FRD v1.2.docx
+++ b/FRD v1.2.docx
@@ -2073,48 +2073,33 @@
               <w:t xml:space="preserve">-Se reincorporan los perfiles de usuario como roles con permisos por pantalla: épica EP-6 (AR-11), regla 16, caso de estudio DÍA 9, alcance, dependencias y glosario.</w:t>
             </w:r>
           </w:p>
+          <w:p>
+            <w:pPr>
+              <w:pStyle w:val="normal1"/>
+              <w:rPr>
+                <w:rFonts w:ascii="Calibri" w:hAnsi="Calibri" w:eastAsia="Calibri" w:cs="Calibri"/>
+                <w:sz w:val="19"/>
+                <w:szCs w:val="19"/>
+              </w:rPr>
+            </w:pPr>
+            <w:r>
+              <w:rPr>
+                <w:rFonts w:eastAsia="Calibri" w:cs="Calibri"/>
+                <w:sz w:val="19"/>
+                <w:szCs w:val="19"/>
+              </w:rPr>
+              <w:t xml:space="preserve">-Regla C4: los artículos sin stock entran en la sugerencia aunque no tengan umbral.</w:t>
+            </w:r>
+          </w:p>
         </w:tc>
       </w:tr>
     </w:tbl>
     <w:p>
       <w:pPr>
         <w:pStyle w:val="normal1"/>
-        <w:rPr>
-          <w:rFonts w:ascii="Calibri" w:hAnsi="Calibri" w:eastAsia="Calibri" w:cs="Calibri"/>
-          <w:sz w:val="19"/>
-          <w:szCs w:val="19"/>
-        </w:rPr>
-      </w:pPr>
-      <w:r>
-        <w:rPr>
-          <w:rFonts w:eastAsia="Calibri" w:cs="Calibri"/>
-          <w:sz w:val="19"/>
-          <w:szCs w:val="19"/>
-        </w:rPr>
-        <w:t xml:space="preserve"> </w:t>
-      </w:r>
-    </w:p>
-    <w:p>
-      <w:pPr>
-        <w:pStyle w:val="normal1"/>
-        <w:rPr>
-          <w:rFonts w:ascii="Calibri" w:hAnsi="Calibri" w:eastAsia="Calibri" w:cs="Calibri"/>
-        </w:rPr>
-      </w:pPr>
-      <w:r>
-        <w:rPr>
-          <w:rFonts w:eastAsia="Calibri" w:cs="Calibri"/>
-        </w:rPr>
-      </w:r>
-      <w:r>
-        <w:br w:type="page"/>
-      </w:r>
-    </w:p>
-    <w:p>
-      <w:pPr>
-        <w:pStyle w:val="normal1"/>
         <w:keepNext w:val="true"/>
         <w:keepLines w:val="false"/>
+        <w:pageBreakBefore/>
         <w:widowControl/>
         <w:numPr>
           <w:ilvl w:val="0"/>
@@ -22222,7 +22207,7 @@
               <w:rPr>
                 <w:rFonts w:eastAsia="Old Standard TT" w:cs="Old Standard TT" w:ascii="Old Standard TT" w:hAnsi="Old Standard TT"/>
               </w:rPr>
-              <w:t>Siempre.</w:t>
+              <w:t xml:space="preserve">El artículo tiene umbral mínimo.</w:t>
             </w:r>
           </w:p>
         </w:tc>
@@ -22250,7 +22235,7 @@
               <w:rPr>
                 <w:rFonts w:eastAsia="Old Standard TT" w:cs="Old Standard TT" w:ascii="Old Standard TT" w:hAnsi="Old Standard TT"/>
               </w:rPr>
-              <w:t>El artículo está en C1 o C2.</w:t>
+              <w:t xml:space="preserve">El artículo está en C1 o C2 y tiene umbral.</w:t>
             </w:r>
           </w:p>
         </w:tc>
@@ -22794,7 +22779,7 @@
           <w:shd w:fill="auto" w:val="clear"/>
           <w:vertAlign w:val="baseline"/>
         </w:rPr>
-        <w:t>Si un artículo no tiene umbral mínimo asignado, aplicar la regla C4:</w:t>
+        <w:t xml:space="preserve">Si un artículo con stock no tiene umbral mínimo asignado, aplicar la regla C4:</w:t>
       </w:r>
     </w:p>
     <w:tbl>
@@ -22890,7 +22875,7 @@
               <w:rPr>
                 <w:rFonts w:eastAsia="Old Standard TT" w:cs="Old Standard TT" w:ascii="Old Standard TT" w:hAnsi="Old Standard TT"/>
               </w:rPr>
-              <w:t>No tiene umbral mínimo asignado.</w:t>
+              <w:t xml:space="preserve">No tiene umbral y su stock es mayor a 0.</w:t>
             </w:r>
           </w:p>
         </w:tc>

</xml_diff>